<commit_message>
Registra o resultado final do levantamento de raio-X de consumo (lote 1)
1.072 dos 1.073 municípios com raio-X verificado (99,9%), 821 com pelo
menos uma categoria de consumo identificada. Só "Bela Vista de Goiás"
ficou de fora, com timeout consistente em 3 tentativas — registrado
como gap pontual conhecido, não escondido.

O contêiner reiniciou três vezes durante este levantamento em lote; o
processo sempre retomou de onde parou graças ao campo
raioXAtualizadoEm, sem duplicar trabalho nem perder progresso.

Co-Authored-By: Claude Sonnet 5 <noreply@anthropic.com>
Claude-Session: https://claude.ai/code/session_01PrnhzdCBtHafogpqn4hpiw
</commit_message>
<xml_diff>
--- a/ESCOPO-DO-PROJETO.docx
+++ b/ESCOPO-DO-PROJETO.docx
@@ -4055,6 +4055,34 @@
       </w:pPr>
       <w:r>
         <w:t xml:space="preserve">      (`npm run levantar:raio-x-consumo`) — roda o raio-X pra todos os       municípios já com CNPJ de uma vez, idempotente (pula quem foi       atualizado há menos de 30 dias) e resiliente (uma falha num       município não derruba o lote). Rodado em segundo plano pros 1.073       do lote 1 depois de validado numa amostra de 8.</w:t>
+      </w:r>
+    </w:p>
+    <w:p>
+      <w:pPr>
+        <w:pStyle w:val="ListParagraph"/>
+        <w:numPr>
+          <w:ilvl w:val="0"/>
+          <w:numId w:val="1"/>
+        </w:numPr>
+        <w:spacing w:after="60"/>
+      </w:pPr>
+      <w:r>
+        <w:rPr>
+          <w:b/>
+          <w:bCs/>
+        </w:rPr>
+        <w:t xml:space="preserve">Resultado final do lote 1 (2026-09-26):</w:t>
+      </w:r>
+      <w:r>
+        <w:t xml:space="preserve"> 1.072 dos 1.073</w:t>
+      </w:r>
+    </w:p>
+    <w:p>
+      <w:pPr>
+        <w:spacing w:after="150"/>
+      </w:pPr>
+      <w:r>
+        <w:t xml:space="preserve">      municípios com raio-X verificado (99,9%), 821 com pelo menos uma       categoria de consumo identificada. Só "Prefeitura de Bela Vista de       Goiás" ficou de fora — timeout consistente em 3 tentativas       (provavelmente tem histórico de contratos grande demais pra janela       de 40s por consulta); registrado como gap pontual conhecido, não       escondido, pra revisitar depois (aumentar o timeout só pra esse       caso, ou paginar em janelas menores que 365 dias). A sessão teve o       contêiner reiniciado três vezes no meio deste levantamento em       lote — o processo sempre retomava de onde parou graças ao campo       `raioXAtualizadoEm`, sem duplicar trabalho nem perder progresso já       salvo no banco.</w:t>
       </w:r>
     </w:p>
     <w:p>

</xml_diff>